<commit_message>
docs: Cloud SQL needs --edition=ENTERPRISE
Hit while deploying: Cloud SQL now defaults to the Enterprise Plus
edition, which rejects db-g1-small with 'Invalid Tier'. Enterprise is
the standard edition and takes shared-core tiers.

The guide now carries the flag and a note not to follow the error's own
suggestion — switching to a db-perf-optimized tier would work but puts a
several-hundred-pound-a-month instance under a pilot.

Co-Authored-By: Claude Opus 5 (1M context) <noreply@anthropic.com>
</commit_message>
<xml_diff>
--- a/Magpie-GCP-deployment-guide.docx
+++ b/Magpie-GCP-deployment-guide.docx
@@ -329,6 +329,32 @@
     </w:p>
     <w:p>
       <w:pPr>
+        <w:spacing w:before="200" w:after="40"/>
+      </w:pPr>
+      <w:r>
+        <w:rPr>
+          <w:b/>
+          <w:color w:val="712D85"/>
+          <w:sz w:val="21"/>
+        </w:rPr>
+        <w:t>The --edition flag is not optional</w:t>
+      </w:r>
+    </w:p>
+    <w:p>
+      <w:pPr>
+        <w:spacing w:after="200"/>
+        <w:ind w:left="288"/>
+      </w:pPr>
+      <w:r>
+        <w:rPr>
+          <w:color w:val="5A5060"/>
+          <w:sz w:val="20"/>
+        </w:rPr>
+        <w:t>Cloud SQL now defaults to the Enterprise Plus edition, which rejects small tiers with “Invalid Tier (db-g1-small)”. Enterprise is the standard edition and is what a pilot wants — the smallest Enterprise Plus machine costs several hundred pounds a month. If you hit that error, this flag is the fix; do not change the tier instead.</w:t>
+      </w:r>
+    </w:p>
+    <w:p>
+      <w:pPr>
         <w:spacing w:after="0" w:before="0"/>
         <w:ind w:left="360"/>
       </w:pPr>
@@ -353,6 +379,20 @@
           <w:sz w:val="18"/>
         </w:rPr>
         <w:t xml:space="preserve">  --database-version=POSTGRES_16 \</w:t>
+      </w:r>
+    </w:p>
+    <w:p>
+      <w:pPr>
+        <w:spacing w:after="0" w:before="0"/>
+        <w:ind w:left="360"/>
+      </w:pPr>
+      <w:r>
+        <w:rPr>
+          <w:rFonts w:ascii="Consolas" w:hAnsi="Consolas"/>
+          <w:color w:val="2E1235"/>
+          <w:sz w:val="18"/>
+        </w:rPr>
+        <w:t xml:space="preserve">  --edition=ENTERPRISE \</w:t>
       </w:r>
     </w:p>
     <w:p>

</xml_diff>